<commit_message>
hotfix(productos): 7 docx de 6 planes de negocio con 43 fragmentos chinos/cirílicos/árabes incrustados en frases (192 caracteres → 0), sustituidos por contexto a nivel de run con formato intacto; xlsx y PDF de dl/ verificados limpios
Co-Authored-By: Claude Fable 5 <noreply@anthropic.com>
Claude-Session: https://claude.ai/code/session_017kK9BRAxpAsfsxudgwH42U
</commit_message>
<xml_diff>
--- a/astro-site/public/dl/plan-negocio-bar-restaurante/plan-de-negocio-bar-restaurante.docx
+++ b/astro-site/public/dl/plan-negocio-bar-restaurante/plan-de-negocio-bar-restaurante.docx
@@ -320,7 +320,7 @@
     </w:p>
     <w:p>
       <w:r>
-        <w:t>La inversión total requerida se estima entre 80.000 y 150.000 euros, dependiendo de si el local requiere obra civil completa o existe infraestructura previa. El desglose aproximado incluye: obra y equipamiento de cocina (35.000-55.000 euros), mobiliario y decoración de sala (20.000-30.000 euros),押入れ器具 menores y mise en place (8.000-12.000 euros), fondo de maniobra para los primeros tres meses (15.000-25.000 euros) y gastos de apertura y marketing inicial (8.000-15.000 euros). Esta horquilla permite adaptarse a diferentes escenarios de negociación de alquiler y estado del local, manteniendo siempre un margen de seguridad del 15% sobre la estimación superior.</w:t>
+        <w:t>La inversión total requerida se estima entre 80.000 y 150.000 euros, dependiendo de si el local requiere obra civil completa o existe infraestructura previa. El desglose aproximado incluye: obra y equipamiento de cocina (35.000-55.000 euros), mobiliario y decoración de sala (20.000-30.000 euros), utensilios menores y mise en place (8.000-12.000 euros), fondo de maniobra para los primeros tres meses (15.000-25.000 euros) y gastos de apertura y marketing inicial (8.000-15.000 euros). Esta horquilla permite adaptarse a diferentes escenarios de negociación de alquiler y estado del local, manteniendo siempre un margen de seguridad del 15% sobre la estimación superior.</w:t>
       </w:r>
     </w:p>
     <w:p>
@@ -357,7 +357,7 @@
     </w:p>
     <w:p>
       <w:r>
-        <w:t>El mercado de restauración casual en España en 2026 presenta una oportunidad clara en el segmento medio-alto: el consumidor busca experiencias gastronómicas de calidad sin formalidad, con una inversión por comensal que ronde los 20-25 euros. Este perfil, mayoritariamente urbano y con edades entre 30 y 50 años, representa aproximadamente el 35% del gasto en restauración fuera del hogar, según datos del sector. La pandemia aceleró la preferencia por espacios más reducidos pero con mayor calidad percibida, lo que convierte un local de 60-80 metros cuadrados en una尺寸 óptima para maximizar rentabilidad por metro cuadrado.</w:t>
+        <w:t>El mercado de restauración casual en España en 2026 presenta una oportunidad clara en el segmento medio-alto: el consumidor busca experiencias gastronómicas de calidad sin formalidad, con una inversión por comensal que ronde los 20-25 euros. Este perfil, mayoritariamente urbano y con edades entre 30 y 50 años, representa aproximadamente el 35% del gasto en restauración fuera del hogar, según datos del sector. La pandemia aceleró la preferencia por espacios más reducidos pero con mayor calidad percibida, lo que convierte un local de 60-80 metros cuadrados en una superficie óptima para maximizar rentabilidad por metro cuadrado.</w:t>
       </w:r>
     </w:p>
     <w:p>
@@ -414,7 +414,7 @@
     </w:p>
     <w:p>
       <w:r>
-        <w:t>El ticket medio en un bar-restaurante casual como el proyectado oscila entre 18 y 25 euros en午餐 y entre 22 y 30 euros en cena, dependiendo de la ubicación y el posicionamiento del local. Las zonas urbanas de alta densidad comercial, los entornos empresariales y los barrios con tejido comercial consolidado presentan los mejores indicadores de ticket medio y frecuencia de visita. La combinación de servicio de barra con mesa permite capturar diferentes momentos de consumo y optimizar la rotación, aspecto crítico para la rentabilidad del negocio.</w:t>
+        <w:t>El ticket medio en un bar-restaurante casual como el proyectado oscila entre 18 y 25 euros en comida y entre 22 y 30 euros en cena, dependiendo de la ubicación y el posicionamiento del local. Las zonas urbanas de alta densidad comercial, los entornos empresariales y los barrios con tejido comercial consolidado presentan los mejores indicadores de ticket medio y frecuencia de visita. La combinación de servicio de barra con mesa permite capturar diferentes momentos de consumo y optimizar la rotación, aspecto crítico para la rentabilidad del negocio.</w:t>
       </w:r>
     </w:p>
     <w:p>
@@ -595,12 +595,12 @@
     </w:p>
     <w:p>
       <w:r>
-        <w:t>La apertura diaria incluye verificación de temperaturas de cámaras, revisión de stock de productos críticos, подготовка mise en place según planificación de carta, y checks de funcionalidad de equipos. El proceso de mise en place asigna 90-120 minutos antes del servicio para preparación de elaboraciones base, corte de materias primas, y montaje de líneas de trabajo.</w:t>
+        <w:t>La apertura diaria incluye verificación de temperaturas de cámaras, revisión de stock de productos críticos, preparación de la mise en place según planificación de carta, y checks de funcionalidad de equipos. El proceso de mise en place asigna 90-120 minutos antes del servicio para preparación de elaboraciones base, corte de materias primas, y montaje de líneas de trabajo.</w:t>
       </w:r>
     </w:p>
     <w:p>
       <w:r>
-        <w:t>El flujo de servicio distingue entre modalidad barra, con tiempo medio de servicio de 2-3 minutos por consumición, y modalidad mesa, con tiempo de primera饮料 de 15 minutos y rotación media de cubiertos de 1,2-1,5 en horario lunch y 0,8-1,0 en horario cena. El cierre incluye proceso de cierre de barra, контрол de caja con arqueo documentado, guardado de productos refrigerados, y checklist de cierre de cocina.</w:t>
+        <w:t>El flujo de servicio distingue entre modalidad barra, con tiempo medio de servicio de 2-3 minutos por consumición, y modalidad mesa, con tiempo de primera bebida de 15 minutos y rotación media de cubiertos de 1,2-1,5 en horario lunch y 0,8-1,0 en horario cena. El cierre incluye proceso de cierre de barra, control de caja con arqueo documentado, guardado de productos refrigerados, y checklist de cierre de cocina.</w:t>
       </w:r>
     </w:p>
     <w:p>
@@ -657,7 +657,7 @@
     </w:p>
     <w:p>
       <w:r>
-        <w:t>El perfil del gerente-propietario debe combinar conocimientos de gestión financiera hostelera,capacidad de negociación con proveedores y dominio de herramientas de control de costes. En un negocio de esta inversión,es habitual que el propietario asuma también funciones de dirección operativa durante los primeros doce a dieciocho meses,lo que permite reducir costes fijos mientras se alcanza el punto de equilibrio. El jefe de cocina requiere formación técnica en cocina mediterránea o de mercado,experiencia en carta de бар-restaurante y capacidad de gestión de aprovisionamientos. El convenio colectivo de hostelería establece para este categoría un salario base de 2.134 euros mensuales en catorce pagas,al que se añade el prorrateo de pagas extras y la antigüedad correspondiente.</w:t>
+        <w:t>El perfil del gerente-propietario debe combinar conocimientos de gestión financiera hostelera,capacidad de negociación con proveedores y dominio de herramientas de control de costes. En un negocio de esta inversión,es habitual que el propietario asuma también funciones de dirección operativa durante los primeros doce a dieciocho meses,lo que permite reducir costes fijos mientras se alcanza el punto de equilibrio. El jefe de cocina requiere formación técnica en cocina mediterránea o de mercado,experiencia en carta de bar-restaurante y capacidad de gestión de aprovisionamientos. El convenio colectivo de hostelería establece para este categoría un salario base de 2.134 euros mensuales en catorce pagas,al que se añade el prorrateo de pagas extras y la antigüedad correspondiente.</w:t>
       </w:r>
     </w:p>
     <w:p>
@@ -756,7 +756,7 @@
     </w:p>
     <w:p>
       <w:r>
-        <w:t>La licencia de apertura constituye el elemento más crítico y dilatado del proceso. El permiso de actividad clasificada, necesario para establecimientos de restauración con伏 que superen los 75 metros cuadrados o generen impacto acústico, requiere la presentación de proyecto técnico firmado por arquitecto y la obtención de licencia de obras si existen reformas. El Ayuntamiento de Madrid, por ejemplo, concede licencia de obras en plazo medio de ocho a doce semanas, mientras que la licencia de apertura puede extenderse entre cuatro y seis meses desde la solicitud completa. El coste total de licencias municipales oscila entre 2.000 y 5.000 euros dependiendo del municipio y la necesidad de informes ambientales o acústicos adicionales.</w:t>
+        <w:t>La licencia de apertura constituye el elemento más crítico y dilatado del proceso. El permiso de actividad clasificada, necesario para establecimientos de restauración con locales que superen los 75 metros cuadrados o generen impacto acústico, requiere la presentación de proyecto técnico firmado por arquitecto y la obtención de licencia de obras si existen reformas. El Ayuntamiento de Madrid, por ejemplo, concede licencia de obras en plazo medio de ocho a doce semanas, mientras que la licencia de apertura puede extenderse entre cuatro y seis meses desde la solicitud completa. El coste total de licencias municipales oscila entre 2.000 y 5.000 euros dependiendo del municipio y la necesidad de informes ambientales o acústicos adicionales.</w:t>
       </w:r>
     </w:p>
     <w:p>

</xml_diff>